<commit_message>
Weave KPIs into concierge PD using York's real PD template format
Restructure Key duties into a paired Responsibilities / Performance
Indicators table, matching the house style shown in the York Sales
Consultant Position Description example, instead of a separate
standalone KPI section.

Co-Authored-By: Claude Sonnet 5 <noreply@anthropic.com>
Claude-Session: https://claude.ai/code/session_01VK6UyewxtJrczN1ZCuNzV8
</commit_message>
<xml_diff>
--- a/content/careers/Position_Description_Concierge.docx
+++ b/content/careers/Position_Description_Concierge.docx
@@ -132,15 +132,480 @@
         <w:pStyle w:val="Heading2"/>
       </w:pPr>
       <w:r>
-        <w:t xml:space="preserve">2. Key duties and responsibilities</w:t>
-      </w:r>
-    </w:p>
-    <w:p>
-      <w:pPr>
-        <w:pStyle w:val="Heading3"/>
-      </w:pPr>
-      <w:r>
-        <w:t xml:space="preserve">2.1 Customer Welcome &amp; Engagement</w:t>
+        <w:t xml:space="preserve">2. Key duties and performance indicators</w:t>
+      </w:r>
+    </w:p>
+    <w:tbl>
+      <w:tblPr>
+        <w:tblW w:type="dxa" w:w="9360"/>
+        <w:tblBorders>
+          <w:top w:val="single" w:color="auto" w:sz="4"/>
+          <w:left w:val="single" w:color="auto" w:sz="4"/>
+          <w:bottom w:val="single" w:color="auto" w:sz="4"/>
+          <w:right w:val="single" w:color="auto" w:sz="4"/>
+          <w:insideH w:val="single" w:color="auto" w:sz="4"/>
+          <w:insideV w:val="single" w:color="auto" w:sz="4"/>
+        </w:tblBorders>
+      </w:tblPr>
+      <w:tblGrid>
+        <w:gridCol w:w="4680"/>
+        <w:gridCol w:w="4680"/>
+      </w:tblGrid>
+      <w:tr>
+        <w:tc>
+          <w:tcPr>
+            <w:tcW w:type="dxa" w:w="4680"/>
+            <w:shd w:fill="D9D9D9" w:val="clear"/>
+            <w:vAlign w:val="center"/>
+          </w:tcPr>
+          <w:p>
+            <w:r>
+              <w:rPr>
+                <w:b/>
+                <w:bCs/>
+              </w:rPr>
+              <w:t xml:space="preserve">Responsibilities:</w:t>
+            </w:r>
+          </w:p>
+        </w:tc>
+        <w:tc>
+          <w:tcPr>
+            <w:tcW w:type="dxa" w:w="4680"/>
+            <w:shd w:fill="D9D9D9" w:val="clear"/>
+            <w:vAlign w:val="center"/>
+          </w:tcPr>
+          <w:p>
+            <w:r>
+              <w:rPr>
+                <w:b/>
+                <w:bCs/>
+              </w:rPr>
+              <w:t xml:space="preserve">Performance Indicators:</w:t>
+            </w:r>
+          </w:p>
+        </w:tc>
+      </w:tr>
+      <w:tr>
+        <w:tc>
+          <w:tcPr>
+            <w:tcW w:type="dxa" w:w="9360"/>
+            <w:gridSpan w:val="2"/>
+            <w:shd w:fill="F2F2F2" w:val="clear"/>
+          </w:tcPr>
+          <w:p>
+            <w:r>
+              <w:rPr>
+                <w:b/>
+                <w:bCs/>
+              </w:rPr>
+              <w:t xml:space="preserve">Customer Welcome &amp; Engagement</w:t>
+            </w:r>
+          </w:p>
+        </w:tc>
+      </w:tr>
+      <w:tr>
+        <w:tc>
+          <w:tcPr>
+            <w:tcW w:type="dxa" w:w="4680"/>
+          </w:tcPr>
+          <w:p>
+            <w:pPr>
+              <w:pStyle w:val="ListParagraph"/>
+              <w:numPr>
+                <w:ilvl w:val="0"/>
+                <w:numId w:val="2"/>
+              </w:numPr>
+            </w:pPr>
+            <w:r>
+              <w:t xml:space="preserve">Greet and welcome all customers entering the store</w:t>
+            </w:r>
+          </w:p>
+          <w:p>
+            <w:pPr>
+              <w:pStyle w:val="ListParagraph"/>
+              <w:numPr>
+                <w:ilvl w:val="0"/>
+                <w:numId w:val="2"/>
+              </w:numPr>
+            </w:pPr>
+            <w:r>
+              <w:t xml:space="preserve">Create a positive, five-star first impression of the store and the York Jewellers brand</w:t>
+            </w:r>
+          </w:p>
+          <w:p>
+            <w:pPr>
+              <w:pStyle w:val="ListParagraph"/>
+              <w:numPr>
+                <w:ilvl w:val="0"/>
+                <w:numId w:val="2"/>
+              </w:numPr>
+            </w:pPr>
+            <w:r>
+              <w:t xml:space="preserve">Provide customers with information and direct them to the appropriate product, service or team member</w:t>
+            </w:r>
+          </w:p>
+          <w:p>
+            <w:pPr>
+              <w:pStyle w:val="ListParagraph"/>
+              <w:numPr>
+                <w:ilvl w:val="0"/>
+                <w:numId w:val="2"/>
+              </w:numPr>
+            </w:pPr>
+            <w:r>
+              <w:t xml:space="preserve">Foster a warm, welcoming atmosphere for all visitors</w:t>
+            </w:r>
+          </w:p>
+        </w:tc>
+        <w:tc>
+          <w:tcPr>
+            <w:tcW w:type="dxa" w:w="4680"/>
+          </w:tcPr>
+          <w:p>
+            <w:pPr>
+              <w:pStyle w:val="ListParagraph"/>
+              <w:numPr>
+                <w:ilvl w:val="0"/>
+                <w:numId w:val="2"/>
+              </w:numPr>
+            </w:pPr>
+            <w:r>
+              <w:t xml:space="preserve">Every customer is greeted warmly and promptly on entry</w:t>
+            </w:r>
+          </w:p>
+          <w:p>
+            <w:pPr>
+              <w:pStyle w:val="ListParagraph"/>
+              <w:numPr>
+                <w:ilvl w:val="0"/>
+                <w:numId w:val="2"/>
+              </w:numPr>
+            </w:pPr>
+            <w:r>
+              <w:t xml:space="preserve">Customers consistently describe their first impression of the store as positive and welcoming</w:t>
+            </w:r>
+          </w:p>
+          <w:p>
+            <w:pPr>
+              <w:pStyle w:val="ListParagraph"/>
+              <w:numPr>
+                <w:ilvl w:val="0"/>
+                <w:numId w:val="2"/>
+              </w:numPr>
+            </w:pPr>
+            <w:r>
+              <w:t xml:space="preserve">Customers are accurately directed to the right product, service or team member with minimal delay</w:t>
+            </w:r>
+          </w:p>
+          <w:p>
+            <w:pPr>
+              <w:pStyle w:val="ListParagraph"/>
+              <w:numPr>
+                <w:ilvl w:val="0"/>
+                <w:numId w:val="2"/>
+              </w:numPr>
+            </w:pPr>
+            <w:r>
+              <w:t xml:space="preserve">Positive customer feedback on the welcome experience</w:t>
+            </w:r>
+          </w:p>
+        </w:tc>
+      </w:tr>
+      <w:tr>
+        <w:tc>
+          <w:tcPr>
+            <w:tcW w:type="dxa" w:w="9360"/>
+            <w:gridSpan w:val="2"/>
+            <w:shd w:fill="F2F2F2" w:val="clear"/>
+          </w:tcPr>
+          <w:p>
+            <w:r>
+              <w:rPr>
+                <w:b/>
+                <w:bCs/>
+              </w:rPr>
+              <w:t xml:space="preserve">Store Support &amp; Presentation</w:t>
+            </w:r>
+          </w:p>
+        </w:tc>
+      </w:tr>
+      <w:tr>
+        <w:tc>
+          <w:tcPr>
+            <w:tcW w:type="dxa" w:w="4680"/>
+          </w:tcPr>
+          <w:p>
+            <w:pPr>
+              <w:pStyle w:val="ListParagraph"/>
+              <w:numPr>
+                <w:ilvl w:val="0"/>
+                <w:numId w:val="2"/>
+              </w:numPr>
+            </w:pPr>
+            <w:r>
+              <w:t xml:space="preserve">Support the retail team on the floor, particularly during peak trading periods</w:t>
+            </w:r>
+          </w:p>
+          <w:p>
+            <w:pPr>
+              <w:pStyle w:val="ListParagraph"/>
+              <w:numPr>
+                <w:ilvl w:val="0"/>
+                <w:numId w:val="2"/>
+              </w:numPr>
+            </w:pPr>
+            <w:r>
+              <w:t xml:space="preserve">Maintain a high standard of store presentation throughout the day</w:t>
+            </w:r>
+          </w:p>
+          <w:p>
+            <w:pPr>
+              <w:pStyle w:val="ListParagraph"/>
+              <w:numPr>
+                <w:ilvl w:val="0"/>
+                <w:numId w:val="2"/>
+              </w:numPr>
+            </w:pPr>
+            <w:r>
+              <w:t xml:space="preserve">Assist with the smooth day-to-day operation of the store, including during Christmas trading</w:t>
+            </w:r>
+          </w:p>
+          <w:p>
+            <w:pPr>
+              <w:pStyle w:val="ListParagraph"/>
+              <w:numPr>
+                <w:ilvl w:val="0"/>
+                <w:numId w:val="2"/>
+              </w:numPr>
+            </w:pPr>
+            <w:r>
+              <w:t xml:space="preserve">Represent the store professionally at all times in line with company standards</w:t>
+            </w:r>
+          </w:p>
+        </w:tc>
+        <w:tc>
+          <w:tcPr>
+            <w:tcW w:type="dxa" w:w="4680"/>
+          </w:tcPr>
+          <w:p>
+            <w:pPr>
+              <w:pStyle w:val="ListParagraph"/>
+              <w:numPr>
+                <w:ilvl w:val="0"/>
+                <w:numId w:val="2"/>
+              </w:numPr>
+            </w:pPr>
+            <w:r>
+              <w:t xml:space="preserve">Retail team is actively and effectively supported during peak trading periods</w:t>
+            </w:r>
+          </w:p>
+          <w:p>
+            <w:pPr>
+              <w:pStyle w:val="ListParagraph"/>
+              <w:numPr>
+                <w:ilvl w:val="0"/>
+                <w:numId w:val="2"/>
+              </w:numPr>
+            </w:pPr>
+            <w:r>
+              <w:t xml:space="preserve">Store presentation is maintained to standard throughout each shift</w:t>
+            </w:r>
+          </w:p>
+          <w:p>
+            <w:pPr>
+              <w:pStyle w:val="ListParagraph"/>
+              <w:numPr>
+                <w:ilvl w:val="0"/>
+                <w:numId w:val="2"/>
+              </w:numPr>
+            </w:pPr>
+            <w:r>
+              <w:t xml:space="preserve">Store operations run smoothly with no avoidable disruptions during Christmas trading</w:t>
+            </w:r>
+          </w:p>
+          <w:p>
+            <w:pPr>
+              <w:pStyle w:val="ListParagraph"/>
+              <w:numPr>
+                <w:ilvl w:val="0"/>
+                <w:numId w:val="2"/>
+              </w:numPr>
+            </w:pPr>
+            <w:r>
+              <w:t xml:space="preserve">Professional conduct and presentation consistently maintained</w:t>
+            </w:r>
+          </w:p>
+        </w:tc>
+      </w:tr>
+      <w:tr>
+        <w:tc>
+          <w:tcPr>
+            <w:tcW w:type="dxa" w:w="9360"/>
+            <w:gridSpan w:val="2"/>
+            <w:shd w:fill="F2F2F2" w:val="clear"/>
+          </w:tcPr>
+          <w:p>
+            <w:r>
+              <w:rPr>
+                <w:b/>
+                <w:bCs/>
+              </w:rPr>
+              <w:t xml:space="preserve">Customer Service &amp; Escalation</w:t>
+            </w:r>
+          </w:p>
+        </w:tc>
+      </w:tr>
+      <w:tr>
+        <w:tc>
+          <w:tcPr>
+            <w:tcW w:type="dxa" w:w="4680"/>
+          </w:tcPr>
+          <w:p>
+            <w:pPr>
+              <w:pStyle w:val="ListParagraph"/>
+              <w:numPr>
+                <w:ilvl w:val="0"/>
+                <w:numId w:val="2"/>
+              </w:numPr>
+            </w:pPr>
+            <w:r>
+              <w:t xml:space="preserve">Monitor the customer experience and respond to enquiries in a friendly, timely manner</w:t>
+            </w:r>
+          </w:p>
+          <w:p>
+            <w:pPr>
+              <w:pStyle w:val="ListParagraph"/>
+              <w:numPr>
+                <w:ilvl w:val="0"/>
+                <w:numId w:val="2"/>
+              </w:numPr>
+            </w:pPr>
+            <w:r>
+              <w:t xml:space="preserve">Escalate customer complaints or complex enquiries to management</w:t>
+            </w:r>
+          </w:p>
+        </w:tc>
+        <w:tc>
+          <w:tcPr>
+            <w:tcW w:type="dxa" w:w="4680"/>
+          </w:tcPr>
+          <w:p>
+            <w:pPr>
+              <w:pStyle w:val="ListParagraph"/>
+              <w:numPr>
+                <w:ilvl w:val="0"/>
+                <w:numId w:val="2"/>
+              </w:numPr>
+            </w:pPr>
+            <w:r>
+              <w:t xml:space="preserve">Customer enquiries are responded to promptly and in a friendly manner</w:t>
+            </w:r>
+          </w:p>
+          <w:p>
+            <w:pPr>
+              <w:pStyle w:val="ListParagraph"/>
+              <w:numPr>
+                <w:ilvl w:val="0"/>
+                <w:numId w:val="2"/>
+              </w:numPr>
+            </w:pPr>
+            <w:r>
+              <w:t xml:space="preserve">Complaints and complex enquiries are escalated to management promptly and appropriately</w:t>
+            </w:r>
+          </w:p>
+        </w:tc>
+      </w:tr>
+      <w:tr>
+        <w:tc>
+          <w:tcPr>
+            <w:tcW w:type="dxa" w:w="9360"/>
+            <w:gridSpan w:val="2"/>
+            <w:shd w:fill="F2F2F2" w:val="clear"/>
+          </w:tcPr>
+          <w:p>
+            <w:r>
+              <w:rPr>
+                <w:b/>
+                <w:bCs/>
+              </w:rPr>
+              <w:t xml:space="preserve">Reliability &amp; Attendance</w:t>
+            </w:r>
+          </w:p>
+        </w:tc>
+      </w:tr>
+      <w:tr>
+        <w:tc>
+          <w:tcPr>
+            <w:tcW w:type="dxa" w:w="4680"/>
+          </w:tcPr>
+          <w:p>
+            <w:pPr>
+              <w:pStyle w:val="ListParagraph"/>
+              <w:numPr>
+                <w:ilvl w:val="0"/>
+                <w:numId w:val="2"/>
+              </w:numPr>
+            </w:pPr>
+            <w:r>
+              <w:t xml:space="preserve">Attend all rostered shifts, Thursday to Sunday, for the duration of the placement</w:t>
+            </w:r>
+          </w:p>
+          <w:p>
+            <w:pPr>
+              <w:pStyle w:val="ListParagraph"/>
+              <w:numPr>
+                <w:ilvl w:val="0"/>
+                <w:numId w:val="2"/>
+              </w:numPr>
+            </w:pPr>
+            <w:r>
+              <w:t xml:space="preserve">Arrive on time and ready to work for each shift</w:t>
+            </w:r>
+          </w:p>
+        </w:tc>
+        <w:tc>
+          <w:tcPr>
+            <w:tcW w:type="dxa" w:w="4680"/>
+          </w:tcPr>
+          <w:p>
+            <w:pPr>
+              <w:pStyle w:val="ListParagraph"/>
+              <w:numPr>
+                <w:ilvl w:val="0"/>
+                <w:numId w:val="2"/>
+              </w:numPr>
+            </w:pPr>
+            <w:r>
+              <w:t xml:space="preserve">Consistent attendance and punctuality across all rostered shifts</w:t>
+            </w:r>
+          </w:p>
+          <w:p>
+            <w:pPr>
+              <w:pStyle w:val="ListParagraph"/>
+              <w:numPr>
+                <w:ilvl w:val="0"/>
+                <w:numId w:val="2"/>
+              </w:numPr>
+            </w:pPr>
+            <w:r>
+              <w:t xml:space="preserve">No unexplained absences or lateness</w:t>
+            </w:r>
+          </w:p>
+        </w:tc>
+      </w:tr>
+    </w:tbl>
+    <w:p/>
+    <w:p>
+      <w:pPr>
+        <w:pStyle w:val="Heading2"/>
+      </w:pPr>
+      <w:r>
+        <w:t xml:space="preserve">3. Authority and accountability</w:t>
+      </w:r>
+    </w:p>
+    <w:p>
+      <w:r>
+        <w:t xml:space="preserve">The Concierge:</w:t>
       </w:r>
     </w:p>
     <w:p>
@@ -152,7 +617,7 @@
         </w:numPr>
       </w:pPr>
       <w:r>
-        <w:t xml:space="preserve">Greet and welcome all customers entering the store</w:t>
+        <w:t xml:space="preserve">Works under direct supervision with defined outcomes</w:t>
       </w:r>
     </w:p>
     <w:p>
@@ -164,7 +629,7 @@
         </w:numPr>
       </w:pPr>
       <w:r>
-        <w:t xml:space="preserve">Create a positive, five-star first impression of the store and the York Jewellers brand</w:t>
+        <w:t xml:space="preserve">Exercises judgement within established store procedures</w:t>
       </w:r>
     </w:p>
     <w:p>
@@ -176,7 +641,7 @@
         </w:numPr>
       </w:pPr>
       <w:r>
-        <w:t xml:space="preserve">Provide customers with information and direct them to the appropriate product, service or team member</w:t>
+        <w:t xml:space="preserve">Is accountable for creating a positive and welcoming customer experience</w:t>
       </w:r>
     </w:p>
     <w:p>
@@ -188,7 +653,20 @@
         </w:numPr>
       </w:pPr>
       <w:r>
-        <w:t xml:space="preserve">Foster a warm, welcoming atmosphere for all visitors</w:t>
+        <w:t xml:space="preserve">Escalates customer or operational issues to management</w:t>
+      </w:r>
+    </w:p>
+    <w:p>
+      <w:r>
+        <w:t xml:space="preserve">Budget authority: None.</w:t>
+      </w:r>
+    </w:p>
+    <w:p>
+      <w:pPr>
+        <w:pStyle w:val="Heading2"/>
+      </w:pPr>
+      <w:r>
+        <w:t xml:space="preserve">4. Skills and experience</w:t>
       </w:r>
     </w:p>
     <w:p>
@@ -196,7 +674,7 @@
         <w:pStyle w:val="Heading3"/>
       </w:pPr>
       <w:r>
-        <w:t xml:space="preserve">2.2 Store Support &amp; Presentation</w:t>
+        <w:t xml:space="preserve">Essential</w:t>
       </w:r>
     </w:p>
     <w:p>
@@ -208,7 +686,7 @@
         </w:numPr>
       </w:pPr>
       <w:r>
-        <w:t xml:space="preserve">Support the retail team on the floor, particularly during peak trading periods</w:t>
+        <w:t xml:space="preserve">Friendly, approachable and confident personality</w:t>
       </w:r>
     </w:p>
     <w:p>
@@ -220,7 +698,7 @@
         </w:numPr>
       </w:pPr>
       <w:r>
-        <w:t xml:space="preserve">Maintain a high standard of store presentation throughout the day</w:t>
+        <w:t xml:space="preserve">Energetic and enthusiastic approach to work</w:t>
       </w:r>
     </w:p>
     <w:p>
@@ -232,7 +710,7 @@
         </w:numPr>
       </w:pPr>
       <w:r>
-        <w:t xml:space="preserve">Assist with the smooth day-to-day operation of the store, including during Christmas trading</w:t>
+        <w:t xml:space="preserve">Excellent communication and interpersonal skills</w:t>
       </w:r>
     </w:p>
     <w:p>
@@ -244,15 +722,7 @@
         </w:numPr>
       </w:pPr>
       <w:r>
-        <w:t xml:space="preserve">Represent the store professionally at all times in line with company standards</w:t>
-      </w:r>
-    </w:p>
-    <w:p>
-      <w:pPr>
-        <w:pStyle w:val="Heading3"/>
-      </w:pPr>
-      <w:r>
-        <w:t xml:space="preserve">2.3 Customer Service &amp; Escalation</w:t>
+        <w:t xml:space="preserve">Comfortable engaging with customers and creating a welcoming experience</w:t>
       </w:r>
     </w:p>
     <w:p>
@@ -264,7 +734,7 @@
         </w:numPr>
       </w:pPr>
       <w:r>
-        <w:t xml:space="preserve">Monitor the customer experience and respond to enquiries in a friendly, timely manner</w:t>
+        <w:t xml:space="preserve">Reliable and punctual</w:t>
       </w:r>
     </w:p>
     <w:p>
@@ -276,20 +746,7 @@
         </w:numPr>
       </w:pPr>
       <w:r>
-        <w:t xml:space="preserve">Escalate customer complaints or complex enquiries to management</w:t>
-      </w:r>
-    </w:p>
-    <w:p>
-      <w:pPr>
-        <w:pStyle w:val="Heading2"/>
-      </w:pPr>
-      <w:r>
-        <w:t xml:space="preserve">3. Authority and accountability</w:t>
-      </w:r>
-    </w:p>
-    <w:p>
-      <w:r>
-        <w:t xml:space="preserve">The Concierge:</w:t>
+        <w:t xml:space="preserve">Able to stand and remain active for extended periods</w:t>
       </w:r>
     </w:p>
     <w:p>
@@ -301,7 +758,15 @@
         </w:numPr>
       </w:pPr>
       <w:r>
-        <w:t xml:space="preserve">Works under direct supervision with defined outcomes</w:t>
+        <w:t xml:space="preserve">Available Thursday through to Sunday for the duration of the role</w:t>
+      </w:r>
+    </w:p>
+    <w:p>
+      <w:pPr>
+        <w:pStyle w:val="Heading3"/>
+      </w:pPr>
+      <w:r>
+        <w:t xml:space="preserve">Desirable</w:t>
       </w:r>
     </w:p>
     <w:p>
@@ -313,237 +778,11 @@
         </w:numPr>
       </w:pPr>
       <w:r>
-        <w:t xml:space="preserve">Exercises judgement within established store procedures</w:t>
-      </w:r>
-    </w:p>
-    <w:p>
-      <w:pPr>
-        <w:pStyle w:val="ListParagraph"/>
-        <w:numPr>
-          <w:ilvl w:val="0"/>
-          <w:numId w:val="2"/>
-        </w:numPr>
-      </w:pPr>
-      <w:r>
-        <w:t xml:space="preserve">Is accountable for creating a positive and welcoming customer experience</w:t>
-      </w:r>
-    </w:p>
-    <w:p>
-      <w:pPr>
-        <w:pStyle w:val="ListParagraph"/>
-        <w:numPr>
-          <w:ilvl w:val="0"/>
-          <w:numId w:val="2"/>
-        </w:numPr>
-      </w:pPr>
-      <w:r>
-        <w:t xml:space="preserve">Escalates customer or operational issues to management</w:t>
-      </w:r>
-    </w:p>
-    <w:p>
-      <w:r>
-        <w:t xml:space="preserve">Budget authority: None.</w:t>
-      </w:r>
-    </w:p>
-    <w:p>
-      <w:pPr>
-        <w:pStyle w:val="Heading2"/>
-      </w:pPr>
-      <w:r>
-        <w:t xml:space="preserve">4. Skills and experience</w:t>
-      </w:r>
-    </w:p>
-    <w:p>
-      <w:pPr>
-        <w:pStyle w:val="Heading3"/>
-      </w:pPr>
-      <w:r>
-        <w:t xml:space="preserve">Essential</w:t>
-      </w:r>
-    </w:p>
-    <w:p>
-      <w:pPr>
-        <w:pStyle w:val="ListParagraph"/>
-        <w:numPr>
-          <w:ilvl w:val="0"/>
-          <w:numId w:val="2"/>
-        </w:numPr>
-      </w:pPr>
-      <w:r>
-        <w:t xml:space="preserve">Friendly, approachable and confident personality</w:t>
-      </w:r>
-    </w:p>
-    <w:p>
-      <w:pPr>
-        <w:pStyle w:val="ListParagraph"/>
-        <w:numPr>
-          <w:ilvl w:val="0"/>
-          <w:numId w:val="2"/>
-        </w:numPr>
-      </w:pPr>
-      <w:r>
-        <w:t xml:space="preserve">Energetic and enthusiastic approach to work</w:t>
-      </w:r>
-    </w:p>
-    <w:p>
-      <w:pPr>
-        <w:pStyle w:val="ListParagraph"/>
-        <w:numPr>
-          <w:ilvl w:val="0"/>
-          <w:numId w:val="2"/>
-        </w:numPr>
-      </w:pPr>
-      <w:r>
-        <w:t xml:space="preserve">Excellent communication and interpersonal skills</w:t>
-      </w:r>
-    </w:p>
-    <w:p>
-      <w:pPr>
-        <w:pStyle w:val="ListParagraph"/>
-        <w:numPr>
-          <w:ilvl w:val="0"/>
-          <w:numId w:val="2"/>
-        </w:numPr>
-      </w:pPr>
-      <w:r>
-        <w:t xml:space="preserve">Comfortable engaging with customers and creating a welcoming experience</w:t>
-      </w:r>
-    </w:p>
-    <w:p>
-      <w:pPr>
-        <w:pStyle w:val="ListParagraph"/>
-        <w:numPr>
-          <w:ilvl w:val="0"/>
-          <w:numId w:val="2"/>
-        </w:numPr>
-      </w:pPr>
-      <w:r>
-        <w:t xml:space="preserve">Reliable and punctual</w:t>
-      </w:r>
-    </w:p>
-    <w:p>
-      <w:pPr>
-        <w:pStyle w:val="ListParagraph"/>
-        <w:numPr>
-          <w:ilvl w:val="0"/>
-          <w:numId w:val="2"/>
-        </w:numPr>
-      </w:pPr>
-      <w:r>
-        <w:t xml:space="preserve">Able to stand and remain active for extended periods</w:t>
-      </w:r>
-    </w:p>
-    <w:p>
-      <w:pPr>
-        <w:pStyle w:val="ListParagraph"/>
-        <w:numPr>
-          <w:ilvl w:val="0"/>
-          <w:numId w:val="2"/>
-        </w:numPr>
-      </w:pPr>
-      <w:r>
-        <w:t xml:space="preserve">Available Thursday through to Sunday for the duration of the role</w:t>
-      </w:r>
-    </w:p>
-    <w:p>
-      <w:pPr>
-        <w:pStyle w:val="Heading3"/>
-      </w:pPr>
-      <w:r>
-        <w:t xml:space="preserve">Desirable</w:t>
-      </w:r>
-    </w:p>
-    <w:p>
-      <w:pPr>
-        <w:pStyle w:val="ListParagraph"/>
-        <w:numPr>
-          <w:ilvl w:val="0"/>
-          <w:numId w:val="2"/>
-        </w:numPr>
-      </w:pPr>
-      <w:r>
         <w:t xml:space="preserve">Previous experience in retail, hospitality, customer service or concierge roles</w:t>
       </w:r>
     </w:p>
     <w:p>
       <w:pPr>
-        <w:pStyle w:val="Heading2"/>
-      </w:pPr>
-      <w:r>
-        <w:t xml:space="preserve">5. Key Performance Indicators (KPIs)</w:t>
-      </w:r>
-    </w:p>
-    <w:p>
-      <w:r>
-        <w:t xml:space="preserve">Given the casual, fixed-term nature of this role, KPIs will be reviewed informally by the Store Manager over the course of the placement.</w:t>
-      </w:r>
-    </w:p>
-    <w:p>
-      <w:pPr>
-        <w:pStyle w:val="Heading3"/>
-      </w:pPr>
-      <w:r>
-        <w:t xml:space="preserve">5.1 Customer Experience</w:t>
-      </w:r>
-    </w:p>
-    <w:p>
-      <w:pPr>
-        <w:pStyle w:val="ListParagraph"/>
-        <w:numPr>
-          <w:ilvl w:val="0"/>
-          <w:numId w:val="2"/>
-        </w:numPr>
-      </w:pPr>
-      <w:r>
-        <w:t xml:space="preserve">Consistently warm, professional greeting of customers</w:t>
-      </w:r>
-    </w:p>
-    <w:p>
-      <w:pPr>
-        <w:pStyle w:val="ListParagraph"/>
-        <w:numPr>
-          <w:ilvl w:val="0"/>
-          <w:numId w:val="2"/>
-        </w:numPr>
-      </w:pPr>
-      <w:r>
-        <w:t xml:space="preserve">Positive customer feedback</w:t>
-      </w:r>
-    </w:p>
-    <w:p>
-      <w:pPr>
-        <w:pStyle w:val="Heading3"/>
-      </w:pPr>
-      <w:r>
-        <w:t xml:space="preserve">5.2 Reliability &amp; Presentation</w:t>
-      </w:r>
-    </w:p>
-    <w:p>
-      <w:pPr>
-        <w:pStyle w:val="ListParagraph"/>
-        <w:numPr>
-          <w:ilvl w:val="0"/>
-          <w:numId w:val="2"/>
-        </w:numPr>
-      </w:pPr>
-      <w:r>
-        <w:t xml:space="preserve">Punctuality and attendance across rostered shifts</w:t>
-      </w:r>
-    </w:p>
-    <w:p>
-      <w:pPr>
-        <w:pStyle w:val="ListParagraph"/>
-        <w:numPr>
-          <w:ilvl w:val="0"/>
-          <w:numId w:val="2"/>
-        </w:numPr>
-      </w:pPr>
-      <w:r>
-        <w:t xml:space="preserve">Store presentation maintained to standard</w:t>
-      </w:r>
-    </w:p>
-    <w:p>
-      <w:pPr>
         <w:pStyle w:val="Heading1"/>
       </w:pPr>
       <w:r>
@@ -552,7 +791,7 @@
     </w:p>
     <w:p>
       <w:r>
-        <w:t xml:space="preserve">Given the fixed-term nature of this position, a brief performance check-in may be conducted with the Store Manager, assessing:</w:t>
+        <w:t xml:space="preserve">Given the fixed-term nature of this position, a brief performance check-in may be conducted with the Store Manager, assessed against the performance indicators set out above, covering:</w:t>
       </w:r>
     </w:p>
     <w:p>

</xml_diff>

<commit_message>
Add Our Values, Physical Demands, Signatures and Document Control
Bring the concierge PD fully in line with York's house PD template
(York Sales Consultant PD), adding the company values statement,
physical demands, sign-off block, and document control table.

Co-Authored-By: Claude Sonnet 5 <noreply@anthropic.com>
Claude-Session: https://claude.ai/code/session_01VK6UyewxtJrczN1ZCuNzV8
</commit_message>
<xml_diff>
--- a/content/careers/Position_Description_Concierge.docx
+++ b/content/careers/Position_Description_Concierge.docx
@@ -783,6 +783,190 @@
     </w:p>
     <w:p>
       <w:pPr>
+        <w:pStyle w:val="Heading2"/>
+      </w:pPr>
+      <w:r>
+        <w:t xml:space="preserve">5. Our values</w:t>
+      </w:r>
+    </w:p>
+    <w:p>
+      <w:r>
+        <w:t xml:space="preserve">York Jewellers needs, values and expects team members to at all times act in accordance with our values of:</w:t>
+      </w:r>
+    </w:p>
+    <w:tbl>
+      <w:tblPr>
+        <w:tblW w:type="dxa" w:w="9360"/>
+        <w:tblBorders>
+          <w:top w:val="single" w:color="auto" w:sz="4"/>
+          <w:left w:val="single" w:color="auto" w:sz="4"/>
+          <w:bottom w:val="single" w:color="auto" w:sz="4"/>
+          <w:right w:val="single" w:color="auto" w:sz="4"/>
+          <w:insideH w:val="single" w:color="auto" w:sz="4"/>
+          <w:insideV w:val="single" w:color="auto" w:sz="4"/>
+        </w:tblBorders>
+      </w:tblPr>
+      <w:tblGrid>
+        <w:gridCol w:w="3168"/>
+        <w:gridCol w:w="6191"/>
+      </w:tblGrid>
+      <w:tr>
+        <w:tc>
+          <w:tcPr>
+            <w:tcW w:type="dxa" w:w="3168"/>
+          </w:tcPr>
+          <w:p>
+            <w:r>
+              <w:rPr>
+                <w:b/>
+                <w:bCs/>
+              </w:rPr>
+              <w:t xml:space="preserve">SERVICE:</w:t>
+            </w:r>
+          </w:p>
+          <w:p>
+            <w:r>
+              <w:rPr>
+                <w:i/>
+                <w:iCs/>
+              </w:rPr>
+              <w:t xml:space="preserve">We provide an “above and beyond” service experience.</w:t>
+            </w:r>
+          </w:p>
+        </w:tc>
+        <w:tc>
+          <w:tcPr>
+            <w:tcW w:type="dxa" w:w="6191"/>
+          </w:tcPr>
+          <w:p>
+            <w:r>
+              <w:t xml:space="preserve">Service is at the core of our current and future success. We are committed to setting new service benchmarks in the industry and ensuring our customers receive an “above and beyond” service experience. Our service is at all times prompt, friendly, courteous, professional and reflective of the quality of our products.</w:t>
+            </w:r>
+          </w:p>
+        </w:tc>
+      </w:tr>
+      <w:tr>
+        <w:tc>
+          <w:tcPr>
+            <w:tcW w:type="dxa" w:w="3168"/>
+          </w:tcPr>
+          <w:p>
+            <w:r>
+              <w:rPr>
+                <w:b/>
+                <w:bCs/>
+              </w:rPr>
+              <w:t xml:space="preserve">QUALITY:</w:t>
+            </w:r>
+          </w:p>
+          <w:p>
+            <w:r>
+              <w:rPr>
+                <w:i/>
+                <w:iCs/>
+              </w:rPr>
+              <w:t xml:space="preserve">Exceptional quality is the only option.</w:t>
+            </w:r>
+          </w:p>
+        </w:tc>
+        <w:tc>
+          <w:tcPr>
+            <w:tcW w:type="dxa" w:w="6191"/>
+          </w:tcPr>
+          <w:p>
+            <w:r>
+              <w:t xml:space="preserve">We take great pride in, are respected and frequently recommended for our design flair, quality workmanship and attention to detail. Exceptional quality is the only option. Our commitment to and expectation of quality extends to all roles and functions across the business.</w:t>
+            </w:r>
+          </w:p>
+        </w:tc>
+      </w:tr>
+      <w:tr>
+        <w:tc>
+          <w:tcPr>
+            <w:tcW w:type="dxa" w:w="3168"/>
+          </w:tcPr>
+          <w:p>
+            <w:r>
+              <w:rPr>
+                <w:b/>
+                <w:bCs/>
+              </w:rPr>
+              <w:t xml:space="preserve">RESPECT AND HONESTY:</w:t>
+            </w:r>
+          </w:p>
+          <w:p>
+            <w:r>
+              <w:rPr>
+                <w:i/>
+                <w:iCs/>
+              </w:rPr>
+              <w:t xml:space="preserve">With this, we will succeed.</w:t>
+            </w:r>
+          </w:p>
+        </w:tc>
+        <w:tc>
+          <w:tcPr>
+            <w:tcW w:type="dxa" w:w="6191"/>
+          </w:tcPr>
+          <w:p>
+            <w:r>
+              <w:t xml:space="preserve">We acknowledge and respect the contributions, opinions, qualities and talents of those we work with, our business partners and our customers. At all times, we treat others with respect, empathy and honesty.</w:t>
+            </w:r>
+          </w:p>
+        </w:tc>
+      </w:tr>
+      <w:tr>
+        <w:tc>
+          <w:tcPr>
+            <w:tcW w:type="dxa" w:w="3168"/>
+          </w:tcPr>
+          <w:p>
+            <w:r>
+              <w:rPr>
+                <w:b/>
+                <w:bCs/>
+              </w:rPr>
+              <w:t xml:space="preserve">GROWTH:</w:t>
+            </w:r>
+          </w:p>
+          <w:p>
+            <w:r>
+              <w:rPr>
+                <w:i/>
+                <w:iCs/>
+              </w:rPr>
+              <w:t xml:space="preserve">Together we grow.</w:t>
+            </w:r>
+          </w:p>
+        </w:tc>
+        <w:tc>
+          <w:tcPr>
+            <w:tcW w:type="dxa" w:w="6191"/>
+          </w:tcPr>
+          <w:p>
+            <w:r>
+              <w:t xml:space="preserve">We are committed to continuing the growth and success of our first 40 years, and providing opportunities for those who partner with us to achieve personal growth and success.</w:t>
+            </w:r>
+          </w:p>
+        </w:tc>
+      </w:tr>
+    </w:tbl>
+    <w:p/>
+    <w:p>
+      <w:pPr>
+        <w:pStyle w:val="Heading2"/>
+      </w:pPr>
+      <w:r>
+        <w:t xml:space="preserve">6. Physical demands</w:t>
+      </w:r>
+    </w:p>
+    <w:p>
+      <w:r>
+        <w:t xml:space="preserve">The role does not place any unusual physical demands upon the incumbent, except prolonged standing during shifts.</w:t>
+      </w:r>
+    </w:p>
+    <w:p>
+      <w:pPr>
         <w:pStyle w:val="Heading1"/>
       </w:pPr>
       <w:r>
@@ -831,6 +1015,251 @@
         <w:t xml:space="preserve">Rating Scale: 1: Unsatisfactory  2: Needs Improvement  3: Meets Expectations  4: Exceeds Expectations  5: Outstanding</w:t>
       </w:r>
     </w:p>
+    <w:p>
+      <w:pPr>
+        <w:pStyle w:val="Heading1"/>
+      </w:pPr>
+      <w:r>
+        <w:t xml:space="preserve">Signatures</w:t>
+      </w:r>
+    </w:p>
+    <w:p>
+      <w:r>
+        <w:t xml:space="preserve">(Staff Member): I understand the requirements and expectations of this position.</w:t>
+      </w:r>
+    </w:p>
+    <w:tbl>
+      <w:tblPr>
+        <w:tblW w:type="dxa" w:w="9360"/>
+        <w:tblBorders>
+          <w:top w:val="single" w:color="auto" w:sz="4"/>
+          <w:left w:val="single" w:color="auto" w:sz="4"/>
+          <w:bottom w:val="single" w:color="auto" w:sz="4"/>
+          <w:right w:val="single" w:color="auto" w:sz="4"/>
+          <w:insideH w:val="single" w:color="auto" w:sz="4"/>
+          <w:insideV w:val="single" w:color="auto" w:sz="4"/>
+        </w:tblBorders>
+      </w:tblPr>
+      <w:tblGrid>
+        <w:gridCol w:w="2340"/>
+        <w:gridCol w:w="2340"/>
+        <w:gridCol w:w="2340"/>
+        <w:gridCol w:w="2340"/>
+      </w:tblGrid>
+      <w:tr>
+        <w:tc>
+          <w:tcPr>
+            <w:tcW w:type="dxa" w:w="2340"/>
+          </w:tcPr>
+          <w:p/>
+        </w:tc>
+        <w:tc>
+          <w:tcPr>
+            <w:tcW w:type="dxa" w:w="2340"/>
+          </w:tcPr>
+          <w:p/>
+        </w:tc>
+        <w:tc>
+          <w:tcPr>
+            <w:tcW w:type="dxa" w:w="2340"/>
+          </w:tcPr>
+          <w:p/>
+        </w:tc>
+        <w:tc>
+          <w:tcPr>
+            <w:tcW w:type="dxa" w:w="2340"/>
+          </w:tcPr>
+          <w:p/>
+        </w:tc>
+      </w:tr>
+      <w:tr>
+        <w:tc>
+          <w:tcPr>
+            <w:tcW w:type="dxa" w:w="2340"/>
+          </w:tcPr>
+          <w:p>
+            <w:r>
+              <w:rPr>
+                <w:b/>
+                <w:bCs/>
+              </w:rPr>
+              <w:t xml:space="preserve">Staff Member</w:t>
+            </w:r>
+          </w:p>
+        </w:tc>
+        <w:tc>
+          <w:tcPr>
+            <w:tcW w:type="dxa" w:w="2340"/>
+          </w:tcPr>
+          <w:p>
+            <w:r>
+              <w:rPr>
+                <w:b/>
+                <w:bCs/>
+              </w:rPr>
+              <w:t xml:space="preserve">Date</w:t>
+            </w:r>
+          </w:p>
+        </w:tc>
+        <w:tc>
+          <w:tcPr>
+            <w:tcW w:type="dxa" w:w="2340"/>
+          </w:tcPr>
+          <w:p>
+            <w:r>
+              <w:rPr>
+                <w:b/>
+                <w:bCs/>
+              </w:rPr>
+              <w:t xml:space="preserve">Manager</w:t>
+            </w:r>
+          </w:p>
+        </w:tc>
+        <w:tc>
+          <w:tcPr>
+            <w:tcW w:type="dxa" w:w="2340"/>
+          </w:tcPr>
+          <w:p>
+            <w:r>
+              <w:rPr>
+                <w:b/>
+                <w:bCs/>
+              </w:rPr>
+              <w:t xml:space="preserve">Date</w:t>
+            </w:r>
+          </w:p>
+        </w:tc>
+      </w:tr>
+    </w:tbl>
+    <w:p>
+      <w:pPr>
+        <w:pStyle w:val="Heading1"/>
+      </w:pPr>
+      <w:r>
+        <w:t xml:space="preserve">Document control</w:t>
+      </w:r>
+    </w:p>
+    <w:tbl>
+      <w:tblPr>
+        <w:tblW w:type="dxa" w:w="9360"/>
+        <w:tblBorders>
+          <w:top w:val="single" w:color="auto" w:sz="4"/>
+          <w:left w:val="single" w:color="auto" w:sz="4"/>
+          <w:bottom w:val="single" w:color="auto" w:sz="4"/>
+          <w:right w:val="single" w:color="auto" w:sz="4"/>
+          <w:insideH w:val="single" w:color="auto" w:sz="4"/>
+          <w:insideV w:val="single" w:color="auto" w:sz="4"/>
+        </w:tblBorders>
+      </w:tblPr>
+      <w:tblGrid>
+        <w:gridCol w:w="1584"/>
+        <w:gridCol w:w="1296"/>
+        <w:gridCol w:w="2448"/>
+        <w:gridCol w:w="2016"/>
+        <w:gridCol w:w="2016"/>
+      </w:tblGrid>
+      <w:tr>
+        <w:tc>
+          <w:tcPr>
+            <w:shd w:fill="D9D9D9" w:val="clear"/>
+          </w:tcPr>
+          <w:p>
+            <w:r>
+              <w:rPr>
+                <w:b/>
+                <w:bCs/>
+              </w:rPr>
+              <w:t xml:space="preserve">Date</w:t>
+            </w:r>
+          </w:p>
+        </w:tc>
+        <w:tc>
+          <w:tcPr>
+            <w:shd w:fill="D9D9D9" w:val="clear"/>
+          </w:tcPr>
+          <w:p>
+            <w:r>
+              <w:rPr>
+                <w:b/>
+                <w:bCs/>
+              </w:rPr>
+              <w:t xml:space="preserve">Version</w:t>
+            </w:r>
+          </w:p>
+        </w:tc>
+        <w:tc>
+          <w:tcPr>
+            <w:shd w:fill="D9D9D9" w:val="clear"/>
+          </w:tcPr>
+          <w:p>
+            <w:r>
+              <w:rPr>
+                <w:b/>
+                <w:bCs/>
+              </w:rPr>
+              <w:t xml:space="preserve">Drafted By</w:t>
+            </w:r>
+          </w:p>
+        </w:tc>
+        <w:tc>
+          <w:tcPr>
+            <w:shd w:fill="D9D9D9" w:val="clear"/>
+          </w:tcPr>
+          <w:p>
+            <w:r>
+              <w:rPr>
+                <w:b/>
+                <w:bCs/>
+              </w:rPr>
+              <w:t xml:space="preserve">Approved</w:t>
+            </w:r>
+          </w:p>
+        </w:tc>
+        <w:tc>
+          <w:tcPr>
+            <w:shd w:fill="D9D9D9" w:val="clear"/>
+          </w:tcPr>
+          <w:p>
+            <w:r>
+              <w:rPr>
+                <w:b/>
+                <w:bCs/>
+              </w:rPr>
+              <w:t xml:space="preserve">Signature</w:t>
+            </w:r>
+          </w:p>
+        </w:tc>
+      </w:tr>
+      <w:tr>
+        <w:tc>
+          <w:p>
+            <w:r>
+              <w:t xml:space="preserve">26.08.26</w:t>
+            </w:r>
+          </w:p>
+        </w:tc>
+        <w:tc>
+          <w:p>
+            <w:r>
+              <w:t xml:space="preserve">1.0</w:t>
+            </w:r>
+          </w:p>
+        </w:tc>
+        <w:tc>
+          <w:p>
+            <w:r>
+              <w:t xml:space="preserve">[Drafted By]</w:t>
+            </w:r>
+          </w:p>
+        </w:tc>
+        <w:tc>
+          <w:p/>
+        </w:tc>
+        <w:tc>
+          <w:p/>
+        </w:tc>
+      </w:tr>
+    </w:tbl>
     <w:sectPr>
       <w:headerReference w:type="default" r:id="rId7"/>
       <w:pgSz w:w="11906" w:h="16838" w:orient="portrait"/>

</xml_diff>